<commit_message>
update2 the prompt here
</commit_message>
<xml_diff>
--- a/uploaded_resumes/Naukri_Naga[5y_6m].docx
+++ b/uploaded_resumes/Naukri_Naga[5y_6m].docx
@@ -1,7 +1,6 @@
 
 <file path=word/document.xml><?xml version="1.0" encoding="utf-8"?>
-<w:document xmlns:wpc="http://schemas.microsoft.com/office/word/2010/wordprocessingCanvas" xmlns:cx="http://schemas.microsoft.com/office/drawing/2014/chartex" xmlns:cx1="http://schemas.microsoft.com/office/drawing/2015/9/8/chartex" xmlns:cx2="http://schemas.microsoft.com/office/drawing/2015/10/21/chartex" xmlns:cx3="http://schemas.microsoft.com/office/drawing/2016/5/9/chartex" xmlns:cx4="http://schemas.microsoft.com/office/drawing/2016/5/10/chartex" xmlns:cx5="http://schemas.microsoft.com/office/drawing/2016/5/11/chartex" xmlns:mc="http://schemas.openxmlformats.org/markup-compatibility/2006" xmlns:o="urn:schemas-microsoft-com:office:office" xmlns:r="http://schemas.openxmlformats.org/officeDocument/2006/relationships" xmlns:m="http://schemas.openxmlformats.org/officeDocument/2006/math" xmlns:v="urn:schemas-microsoft-com:vml" xmlns:wp14="http://schemas.microsoft.com/office/word/2010/wordprocessingDrawing" xmlns:wp="http://schemas.openxmlformats.org/drawingml/2006/wordprocessingDrawing" xmlns:w10="urn:schemas-microsoft-com:office:word" xmlns:w="http://schemas.openxmlformats.org/wordprocessingml/2006/main" xmlns:w14="http://schemas.microsoft.com/office/word/2010/wordml" xmlns:w15="http://schemas.microsoft.com/office/word/2012/wordml" xmlns:wne="http://schemas.microsoft.com/office/word/2006/wordml" xmlns:wpg="http://schemas.microsoft.com/office/word/2010/wordprocessingGroup" xmlns:wpi="http://schemas.microsoft.com/office/word/2010/wordprocessingInk" xmlns:wps="http://schemas.microsoft.com/office/word/2010/wordprocessingShape" mc:Ignorable="w14 w15 wp14">
-  <!-- Generated by Aspose.Words for Java 18.9 -->
+<w:document xmlns:wpc="http://schemas.microsoft.com/office/word/2010/wordprocessingCanvas" xmlns:cx="http://schemas.microsoft.com/office/drawing/2014/chartex" xmlns:cx1="http://schemas.microsoft.com/office/drawing/2015/9/8/chartex" xmlns:cx2="http://schemas.microsoft.com/office/drawing/2015/10/21/chartex" xmlns:cx3="http://schemas.microsoft.com/office/drawing/2016/5/9/chartex" xmlns:cx4="http://schemas.microsoft.com/office/drawing/2016/5/10/chartex" xmlns:cx5="http://schemas.microsoft.com/office/drawing/2016/5/11/chartex" xmlns:cx6="http://schemas.microsoft.com/office/drawing/2016/5/12/chartex" xmlns:cx7="http://schemas.microsoft.com/office/drawing/2016/5/13/chartex" xmlns:cx8="http://schemas.microsoft.com/office/drawing/2016/5/14/chartex" xmlns:mc="http://schemas.openxmlformats.org/markup-compatibility/2006" xmlns:aink="http://schemas.microsoft.com/office/drawing/2016/ink" xmlns:am3d="http://schemas.microsoft.com/office/drawing/2017/model3d" xmlns:o="urn:schemas-microsoft-com:office:office" xmlns:oel="http://schemas.microsoft.com/office/2019/extlst" xmlns:r="http://schemas.openxmlformats.org/officeDocument/2006/relationships" xmlns:m="http://schemas.openxmlformats.org/officeDocument/2006/math" xmlns:v="urn:schemas-microsoft-com:vml" xmlns:wp14="http://schemas.microsoft.com/office/word/2010/wordprocessingDrawing" xmlns:wp="http://schemas.openxmlformats.org/drawingml/2006/wordprocessingDrawing" xmlns:w10="urn:schemas-microsoft-com:office:word" xmlns:w="http://schemas.openxmlformats.org/wordprocessingml/2006/main" xmlns:w14="http://schemas.microsoft.com/office/word/2010/wordml" xmlns:w15="http://schemas.microsoft.com/office/word/2012/wordml" xmlns:w16cex="http://schemas.microsoft.com/office/word/2018/wordml/cex" xmlns:w16cid="http://schemas.microsoft.com/office/word/2016/wordml/cid" xmlns:w16="http://schemas.microsoft.com/office/word/2018/wordml" xmlns:w16du="http://schemas.microsoft.com/office/word/2023/wordml/word16du" xmlns:w16sdtdh="http://schemas.microsoft.com/office/word/2020/wordml/sdtdatahash" xmlns:w16sdtfl="http://schemas.microsoft.com/office/word/2024/wordml/sdtformatlock" xmlns:w16se="http://schemas.microsoft.com/office/word/2015/wordml/symex" xmlns:wpg="http://schemas.microsoft.com/office/word/2010/wordprocessingGroup" xmlns:wpi="http://schemas.microsoft.com/office/word/2010/wordprocessingInk" xmlns:wne="http://schemas.microsoft.com/office/word/2006/wordml" xmlns:wps="http://schemas.microsoft.com/office/word/2010/wordprocessingShape" mc:Ignorable="w14 w15 w16se w16cid w16 w16cex w16sdtdh w16sdtfl w16du wp14">
   <w:body>
     <w:p>
       <w:pPr>
@@ -40,114 +39,95 @@
           <w:sz w:val="28"/>
           <w:szCs w:val="28"/>
         </w:rPr>
-        <w:t>AGA</w:t>
-      </w:r>
-      <w:r>
-        <w:rPr>
-          <w:rFonts w:ascii="Calibri" w:eastAsia="Calibri" w:hAnsi="Calibri" w:cs="Calibri"/>
-          <w:b/>
-          <w:bCs/>
-          <w:sz w:val="28"/>
-          <w:szCs w:val="28"/>
-        </w:rPr>
+        <w:t xml:space="preserve">AGA </w:t>
+      </w:r>
+      <w:r>
+        <w:rPr>
+          <w:rFonts w:ascii="Calibri" w:eastAsia="Calibri" w:hAnsi="Calibri" w:cs="Calibri"/>
+          <w:sz w:val="22"/>
+          <w:szCs w:val="22"/>
+        </w:rPr>
+        <w:br/>
+      </w:r>
+      <w:r>
+        <w:rPr>
+          <w:rFonts w:ascii="Calibri" w:eastAsia="Calibri" w:hAnsi="Calibri" w:cs="Calibri"/>
+          <w:b/>
+          <w:color w:val="984806" w:themeColor="accent6" w:themeShade="80"/>
+          <w:sz w:val="22"/>
+          <w:szCs w:val="22"/>
+        </w:rPr>
+        <w:t xml:space="preserve">Oracle Financial Functional Consultant               </w:t>
+      </w:r>
+      <w:r>
+        <w:rPr>
+          <w:rFonts w:ascii="Calibri" w:eastAsia="Calibri" w:hAnsi="Calibri" w:cs="Calibri"/>
+          <w:b/>
+          <w:sz w:val="22"/>
+          <w:szCs w:val="22"/>
+        </w:rPr>
+        <w:tab/>
         <w:t xml:space="preserve"> </w:t>
       </w:r>
       <w:r>
         <w:rPr>
           <w:rFonts w:ascii="Calibri" w:eastAsia="Calibri" w:hAnsi="Calibri" w:cs="Calibri"/>
-          <w:sz w:val="22"/>
-          <w:szCs w:val="22"/>
-        </w:rPr>
-        <w:br/>
-      </w:r>
-      <w:r>
-        <w:rPr>
-          <w:rFonts w:ascii="Calibri" w:eastAsia="Calibri" w:hAnsi="Calibri" w:cs="Calibri"/>
-          <w:b/>
-          <w:color w:val="984806" w:themeColor="accent6" w:themeShade="80"/>
-          <w:sz w:val="22"/>
-          <w:szCs w:val="22"/>
-        </w:rPr>
-        <w:t xml:space="preserve">Oracle Financial Functional Consultant               </w:t>
-      </w:r>
-      <w:r>
-        <w:rPr>
-          <w:rFonts w:ascii="Calibri" w:eastAsia="Calibri" w:hAnsi="Calibri" w:cs="Calibri"/>
-          <w:b/>
-          <w:sz w:val="22"/>
-          <w:szCs w:val="22"/>
-        </w:rPr>
-        <w:tab/>
+          <w:b/>
+          <w:sz w:val="22"/>
+          <w:szCs w:val="22"/>
+        </w:rPr>
+        <w:tab/>
+      </w:r>
+      <w:r>
+        <w:rPr>
+          <w:rFonts w:ascii="Calibri" w:eastAsia="Calibri" w:hAnsi="Calibri" w:cs="Calibri"/>
+          <w:b/>
+          <w:sz w:val="22"/>
+          <w:szCs w:val="22"/>
+        </w:rPr>
+        <w:t xml:space="preserve">                </w:t>
+      </w:r>
+    </w:p>
+    <w:p>
+      <w:pPr>
+        <w:rPr>
+          <w:rFonts w:ascii="Calibri" w:eastAsia="Calibri" w:hAnsi="Calibri" w:cs="Calibri"/>
+          <w:b/>
+          <w:sz w:val="22"/>
+          <w:szCs w:val="22"/>
+        </w:rPr>
+      </w:pPr>
+      <w:r>
+        <w:rPr>
+          <w:rFonts w:ascii="Calibri" w:eastAsia="Calibri" w:hAnsi="Calibri" w:cs="Calibri"/>
+          <w:b/>
+          <w:sz w:val="22"/>
+          <w:szCs w:val="22"/>
+        </w:rPr>
+        <w:t>Email</w:t>
+      </w:r>
+      <w:r>
+        <w:rPr>
+          <w:rFonts w:ascii="Calibri" w:eastAsia="Calibri" w:hAnsi="Calibri" w:cs="Calibri"/>
+          <w:b/>
+          <w:sz w:val="22"/>
+          <w:szCs w:val="22"/>
+        </w:rPr>
+        <w:t xml:space="preserve"> ID :</w:t>
+      </w:r>
+      <w:r>
+        <w:rPr>
+          <w:rFonts w:ascii="Calibri" w:eastAsia="Calibri" w:hAnsi="Calibri" w:cs="Calibri"/>
+          <w:b/>
+          <w:sz w:val="22"/>
+          <w:szCs w:val="22"/>
+        </w:rPr>
         <w:t xml:space="preserve"> </w:t>
       </w:r>
       <w:r>
         <w:rPr>
           <w:rFonts w:ascii="Calibri" w:eastAsia="Calibri" w:hAnsi="Calibri" w:cs="Calibri"/>
           <w:b/>
-          <w:sz w:val="22"/>
-          <w:szCs w:val="22"/>
-        </w:rPr>
-        <w:tab/>
-      </w:r>
-      <w:r>
-        <w:rPr>
-          <w:rFonts w:ascii="Calibri" w:eastAsia="Calibri" w:hAnsi="Calibri" w:cs="Calibri"/>
-          <w:b/>
-          <w:sz w:val="22"/>
-          <w:szCs w:val="22"/>
-        </w:rPr>
-        <w:t xml:space="preserve">                </w:t>
-      </w:r>
-    </w:p>
-    <w:p>
-      <w:pPr>
-        <w:rPr>
-          <w:rFonts w:ascii="Calibri" w:eastAsia="Calibri" w:hAnsi="Calibri" w:cs="Calibri"/>
-          <w:b/>
-          <w:sz w:val="22"/>
-          <w:szCs w:val="22"/>
-        </w:rPr>
-      </w:pPr>
-      <w:r>
-        <w:rPr>
-          <w:rFonts w:ascii="Calibri" w:eastAsia="Calibri" w:hAnsi="Calibri" w:cs="Calibri"/>
-          <w:b/>
-          <w:sz w:val="22"/>
-          <w:szCs w:val="22"/>
-        </w:rPr>
-        <w:t>Email</w:t>
-      </w:r>
-      <w:r>
-        <w:rPr>
-          <w:rFonts w:ascii="Calibri" w:eastAsia="Calibri" w:hAnsi="Calibri" w:cs="Calibri"/>
-          <w:b/>
-          <w:sz w:val="22"/>
-          <w:szCs w:val="22"/>
-        </w:rPr>
-        <w:t xml:space="preserve"> </w:t>
-      </w:r>
-      <w:r>
-        <w:rPr>
-          <w:rFonts w:ascii="Calibri" w:eastAsia="Calibri" w:hAnsi="Calibri" w:cs="Calibri"/>
-          <w:b/>
-          <w:sz w:val="22"/>
-          <w:szCs w:val="22"/>
-        </w:rPr>
-        <w:t>ID :</w:t>
-      </w:r>
-      <w:r>
-        <w:rPr>
-          <w:rFonts w:ascii="Calibri" w:eastAsia="Calibri" w:hAnsi="Calibri" w:cs="Calibri"/>
-          <w:b/>
-          <w:sz w:val="22"/>
-          <w:szCs w:val="22"/>
-        </w:rPr>
-        <w:t xml:space="preserve"> </w:t>
-      </w:r>
-      <w:r>
-        <w:rPr>
-          <w:rFonts w:ascii="Calibri" w:eastAsia="Calibri" w:hAnsi="Calibri" w:cs="Calibri"/>
-          <w:b/>
           <w:color w:val="0070C0"/>
           <w:sz w:val="22"/>
           <w:szCs w:val="22"/>
@@ -171,16 +151,7 @@
           <w:sz w:val="22"/>
           <w:szCs w:val="22"/>
         </w:rPr>
-        <w:t>Mobile :</w:t>
-      </w:r>
-      <w:r>
-        <w:rPr>
-          <w:rFonts w:ascii="Calibri" w:eastAsia="Calibri" w:hAnsi="Calibri" w:cs="Calibri"/>
-          <w:b/>
-          <w:sz w:val="22"/>
-          <w:szCs w:val="22"/>
-        </w:rPr>
-        <w:t xml:space="preserve"> </w:t>
+        <w:t xml:space="preserve">Mobile : </w:t>
       </w:r>
       <w:r>
         <w:rPr>
@@ -290,21 +261,7 @@
           <w:sz w:val="22"/>
           <w:szCs w:val="22"/>
         </w:rPr>
-        <w:t xml:space="preserve"> as Functional consultant </w:t>
-      </w:r>
-      <w:r>
-        <w:rPr>
-          <w:sz w:val="22"/>
-          <w:szCs w:val="22"/>
-        </w:rPr>
-        <w:t>in</w:t>
-      </w:r>
-      <w:r>
-        <w:rPr>
-          <w:sz w:val="22"/>
-          <w:szCs w:val="22"/>
-        </w:rPr>
-        <w:t xml:space="preserve"> </w:t>
+        <w:t xml:space="preserve"> as Functional consultant in </w:t>
       </w:r>
       <w:r>
         <w:rPr>
@@ -450,17 +407,7 @@
           <w:sz w:val="22"/>
           <w:szCs w:val="22"/>
         </w:rPr>
-        <w:t>Corefront</w:t>
-      </w:r>
-      <w:r>
-        <w:rPr>
-          <w:rFonts w:ascii="Calibri" w:eastAsia="Calibri" w:hAnsi="Calibri" w:cs="Calibri"/>
-          <w:b/>
-          <w:color w:val="000000"/>
-          <w:sz w:val="22"/>
-          <w:szCs w:val="22"/>
-        </w:rPr>
-        <w:t xml:space="preserve"> Technologies Pvt Ltd</w:t>
+        <w:t>Corefront Technologies Pvt Ltd</w:t>
       </w:r>
       <w:r>
         <w:rPr>
@@ -1231,21 +1178,7 @@
           <w:sz w:val="22"/>
           <w:szCs w:val="22"/>
         </w:rPr>
-        <w:t xml:space="preserve">Finalized Reports like OTBI and BI Reports and </w:t>
-      </w:r>
-      <w:r>
-        <w:rPr>
-          <w:sz w:val="22"/>
-          <w:szCs w:val="22"/>
-        </w:rPr>
-        <w:t>builded</w:t>
-      </w:r>
-      <w:r>
-        <w:rPr>
-          <w:sz w:val="22"/>
-          <w:szCs w:val="22"/>
-        </w:rPr>
-        <w:t xml:space="preserve"> as per client requirements.</w:t>
+        <w:t>Finalized Reports like OTBI and BI Reports and builded as per client requirements.</w:t>
       </w:r>
     </w:p>
     <w:p>
@@ -1272,6 +1205,7 @@
           <w:sz w:val="22"/>
           <w:szCs w:val="22"/>
         </w:rPr>
+        <w:lastRenderedPageBreak/>
         <w:t>Interacting (Onsite &amp; Offshore) with</w:t>
       </w:r>
       <w:r>
@@ -1322,16 +1256,7 @@
           <w:sz w:val="22"/>
           <w:szCs w:val="22"/>
         </w:rPr>
-        <w:t xml:space="preserve"> in</w:t>
-      </w:r>
-      <w:r>
-        <w:rPr>
-          <w:rFonts w:ascii="Calibri" w:eastAsia="Calibri" w:hAnsi="Calibri" w:cs="Calibri"/>
-          <w:color w:val="000000"/>
-          <w:sz w:val="22"/>
-          <w:szCs w:val="22"/>
-        </w:rPr>
-        <w:t xml:space="preserve"> Post Implementation Support and providing Training to End Users.</w:t>
+        <w:t xml:space="preserve"> in Post Implementation Support and providing Training to End Users.</w:t>
       </w:r>
     </w:p>
     <w:p>
@@ -2180,6 +2105,7 @@
         <w:spacing w:line="276" w:lineRule="auto"/>
       </w:pPr>
       <w:r>
+        <w:lastRenderedPageBreak/>
         <w:t>Assisted in month-end close process testing such as accruals, revaluation, and reconciliations.</w:t>
       </w:r>
     </w:p>
@@ -2192,10 +2118,7 @@
         <w:spacing w:line="276" w:lineRule="auto"/>
       </w:pPr>
       <w:r>
-        <w:t>Ensured</w:t>
-      </w:r>
-      <w:r>
-        <w:t xml:space="preserve"> smooth rollout by validating configurations and transactional scenarios before go-live.</w:t>
+        <w:t>Ensured smooth rollout by validating configurations and transactional scenarios before go-live.</w:t>
       </w:r>
     </w:p>
     <w:p>
@@ -2596,23 +2519,7 @@
           <w:sz w:val="22"/>
           <w:szCs w:val="22"/>
         </w:rPr>
-        <w:t xml:space="preserve">Verde Clean Fuels' pioneering technology 'syngas-to-gasoline </w:t>
-      </w:r>
-      <w:r>
-        <w:rPr>
-          <w:rFonts w:ascii="Calibri" w:eastAsia="Calibri" w:hAnsi="Calibri" w:cs="Calibri"/>
-          <w:sz w:val="22"/>
-          <w:szCs w:val="22"/>
-        </w:rPr>
-        <w:t>plus'</w:t>
-      </w:r>
-      <w:r>
-        <w:rPr>
-          <w:rFonts w:ascii="Calibri" w:eastAsia="Calibri" w:hAnsi="Calibri" w:cs="Calibri"/>
-          <w:sz w:val="22"/>
-          <w:szCs w:val="22"/>
-        </w:rPr>
-        <w:t xml:space="preserve"> turns waste feedstocks - namely biomass, municipal solid waste, and renewable natural gas - into gasoline or methanol</w:t>
+        <w:t>Verde Clean Fuels' pioneering technology 'syngas-to-gasoline plus' turns waste feedstocks - namely biomass, municipal solid waste, and renewable natural gas - into gasoline or methanol</w:t>
       </w:r>
     </w:p>
     <w:p>
@@ -2784,23 +2691,7 @@
           <w:sz w:val="22"/>
           <w:szCs w:val="22"/>
         </w:rPr>
-        <w:t xml:space="preserve">Finalized Reports like OTBI and BI Reports and </w:t>
-      </w:r>
-      <w:r>
-        <w:rPr>
-          <w:rFonts w:asciiTheme="majorHAnsi" w:hAnsiTheme="majorHAnsi" w:cstheme="majorHAnsi"/>
-          <w:sz w:val="22"/>
-          <w:szCs w:val="22"/>
-        </w:rPr>
-        <w:t>builded</w:t>
-      </w:r>
-      <w:r>
-        <w:rPr>
-          <w:rFonts w:asciiTheme="majorHAnsi" w:hAnsiTheme="majorHAnsi" w:cstheme="majorHAnsi"/>
-          <w:sz w:val="22"/>
-          <w:szCs w:val="22"/>
-        </w:rPr>
-        <w:t xml:space="preserve"> as per client requirements</w:t>
+        <w:t>Finalized Reports like OTBI and BI Reports and builded as per client requirements</w:t>
       </w:r>
     </w:p>
     <w:p>
@@ -2859,23 +2750,7 @@
           <w:sz w:val="22"/>
           <w:szCs w:val="22"/>
         </w:rPr>
-        <w:t xml:space="preserve">nvolved in Post Implementation Support to resolve the issues raised by </w:t>
-      </w:r>
-      <w:r>
-        <w:rPr>
-          <w:rFonts w:ascii="Calibri" w:eastAsia="Calibri" w:hAnsi="Calibri" w:cs="Calibri"/>
-          <w:sz w:val="22"/>
-          <w:szCs w:val="22"/>
-        </w:rPr>
-        <w:t>user</w:t>
-      </w:r>
-      <w:r>
-        <w:rPr>
-          <w:rFonts w:ascii="Calibri" w:eastAsia="Calibri" w:hAnsi="Calibri" w:cs="Calibri"/>
-          <w:sz w:val="22"/>
-          <w:szCs w:val="22"/>
-        </w:rPr>
-        <w:t xml:space="preserve"> </w:t>
+        <w:t xml:space="preserve">nvolved in Post Implementation Support to resolve the issues raised by user </w:t>
       </w:r>
       <w:r>
         <w:rPr>
@@ -3264,6 +3139,7 @@
           <w:rFonts w:ascii="Calibri" w:eastAsia="Calibri" w:hAnsi="Calibri" w:cs="Calibri"/>
           <w:color w:val="000000"/>
         </w:rPr>
+        <w:lastRenderedPageBreak/>
         <w:t xml:space="preserve">Description:   </w:t>
       </w:r>
       <w:r>
@@ -4087,39 +3963,7 @@
           <w:sz w:val="22"/>
           <w:szCs w:val="22"/>
         </w:rPr>
-        <w:t xml:space="preserve">Testing </w:t>
-      </w:r>
-      <w:r>
-        <w:rPr>
-          <w:rFonts w:ascii="Calibri" w:eastAsia="Calibri" w:hAnsi="Calibri" w:cs="Calibri"/>
-          <w:sz w:val="22"/>
-          <w:szCs w:val="22"/>
-        </w:rPr>
-        <w:t>buy</w:t>
-      </w:r>
-      <w:r>
-        <w:rPr>
-          <w:rFonts w:ascii="Calibri" w:eastAsia="Calibri" w:hAnsi="Calibri" w:cs="Calibri"/>
-          <w:sz w:val="22"/>
-          <w:szCs w:val="22"/>
-        </w:rPr>
-        <w:t xml:space="preserve"> side functionality and Pay side functionality (Requisition and testing approvals for requisition and Auto PO generation, PO match Invoice, non-PO invoice and </w:t>
-      </w:r>
-      <w:r>
-        <w:rPr>
-          <w:rFonts w:ascii="Calibri" w:eastAsia="Calibri" w:hAnsi="Calibri" w:cs="Calibri"/>
-          <w:sz w:val="22"/>
-          <w:szCs w:val="22"/>
-        </w:rPr>
-        <w:t>Pre-approved</w:t>
-      </w:r>
-      <w:r>
-        <w:rPr>
-          <w:rFonts w:ascii="Calibri" w:eastAsia="Calibri" w:hAnsi="Calibri" w:cs="Calibri"/>
-          <w:sz w:val="22"/>
-          <w:szCs w:val="22"/>
-        </w:rPr>
-        <w:t xml:space="preserve"> invoice and payment and payment Batch).</w:t>
+        <w:t>Testing buy side functionality and Pay side functionality (Requisition and testing approvals for requisition and Auto PO generation, PO match Invoice, non-PO invoice and Pre-approved invoice and payment and payment Batch).</w:t>
       </w:r>
     </w:p>
     <w:p>
@@ -4191,6 +4035,7 @@
           <w:sz w:val="22"/>
           <w:szCs w:val="22"/>
         </w:rPr>
+        <w:lastRenderedPageBreak/>
         <w:t xml:space="preserve">                                                                                                                                                                               </w:t>
       </w:r>
     </w:p>
@@ -4577,25 +4422,7 @@
           <w:sz w:val="22"/>
           <w:szCs w:val="22"/>
         </w:rPr>
-        <w:t xml:space="preserve">A Leader in Flexible Film Technology and Products. For over 35 years </w:t>
-      </w:r>
-      <w:r>
-        <w:rPr>
-          <w:rFonts w:ascii="Calibri" w:eastAsia="Calibri" w:hAnsi="Calibri" w:cs="Calibri"/>
-          <w:color w:val="000000"/>
-          <w:sz w:val="22"/>
-          <w:szCs w:val="22"/>
-        </w:rPr>
-        <w:t>Yunhong</w:t>
-      </w:r>
-      <w:r>
-        <w:rPr>
-          <w:rFonts w:ascii="Calibri" w:eastAsia="Calibri" w:hAnsi="Calibri" w:cs="Calibri"/>
-          <w:color w:val="000000"/>
-          <w:sz w:val="22"/>
-          <w:szCs w:val="22"/>
-        </w:rPr>
-        <w:t> CTI Corporation has been leading the way in flexible film technology and products.</w:t>
+        <w:t>A Leader in Flexible Film Technology and Products. For over 35 years Yunhong CTI Corporation has been leading the way in flexible film technology and products.</w:t>
       </w:r>
     </w:p>
     <w:p>
@@ -4767,25 +4594,7 @@
           <w:sz w:val="22"/>
           <w:szCs w:val="22"/>
         </w:rPr>
-        <w:t xml:space="preserve">Documented the issues and related </w:t>
-      </w:r>
-      <w:r>
-        <w:rPr>
-          <w:rFonts w:ascii="Calibri" w:eastAsia="Calibri" w:hAnsi="Calibri" w:cs="Calibri"/>
-          <w:color w:val="000000"/>
-          <w:sz w:val="22"/>
-          <w:szCs w:val="22"/>
-        </w:rPr>
-        <w:t>solution</w:t>
-      </w:r>
-      <w:r>
-        <w:rPr>
-          <w:rFonts w:ascii="Calibri" w:eastAsia="Calibri" w:hAnsi="Calibri" w:cs="Calibri"/>
-          <w:color w:val="000000"/>
-          <w:sz w:val="22"/>
-          <w:szCs w:val="22"/>
-        </w:rPr>
-        <w:t xml:space="preserve"> in the repository for the future reference of the client and other team members</w:t>
+        <w:t>Documented the issues and related solution in the repository for the future reference of the client and other team members</w:t>
       </w:r>
     </w:p>
     <w:p>
@@ -4894,7 +4703,7 @@
         </w:rPr>
       </w:pPr>
       <w:r>
-        <w:pict>
+        <w:pict w14:anchorId="6AFD5A4A">
           <v:shapetype id="_x0000_t75" coordsize="21600,21600" o:spt="75" o:preferrelative="t" path="m@4@5l@4@11@9@11@9@5xe" filled="f" stroked="f">
             <v:stroke joinstyle="miter"/>
             <v:formulas>
@@ -4914,14 +4723,14 @@
             <v:path o:extrusionok="f" gradientshapeok="t" o:connecttype="rect"/>
             <o:lock v:ext="edit" aspectratio="t"/>
           </v:shapetype>
-          <v:shape id="_x0000_s1025" type="#_x0000_t75" style="width:1pt;height:1pt;margin-top:0;margin-left:0;position:absolute;z-index:251658240">
-            <v:imagedata r:id="rId4"/>
+          <v:shape id="_x0000_s1026" type="#_x0000_t75" style="position:absolute;left:0;text-align:left;margin-left:0;margin-top:0;width:1pt;height:1pt;z-index:251658240">
+            <v:imagedata r:id="rId7"/>
           </v:shape>
         </w:pict>
       </w:r>
     </w:p>
     <w:sectPr>
-      <w:headerReference w:type="default" r:id="rId5"/>
+      <w:headerReference w:type="default" r:id="rId8"/>
       <w:pgSz w:w="12240" w:h="15840"/>
       <w:pgMar w:top="1440" w:right="1440" w:bottom="1440" w:left="1440" w:header="0" w:footer="0" w:gutter="0"/>
       <w:pgNumType w:start="1"/>
@@ -4931,8 +4740,46 @@
 </w:document>
 </file>
 
+<file path=word/endnotes.xml><?xml version="1.0" encoding="utf-8"?>
+<w:endnotes xmlns:wpc="http://schemas.microsoft.com/office/word/2010/wordprocessingCanvas" xmlns:cx="http://schemas.microsoft.com/office/drawing/2014/chartex" xmlns:cx1="http://schemas.microsoft.com/office/drawing/2015/9/8/chartex" xmlns:cx2="http://schemas.microsoft.com/office/drawing/2015/10/21/chartex" xmlns:cx3="http://schemas.microsoft.com/office/drawing/2016/5/9/chartex" xmlns:cx4="http://schemas.microsoft.com/office/drawing/2016/5/10/chartex" xmlns:cx5="http://schemas.microsoft.com/office/drawing/2016/5/11/chartex" xmlns:cx6="http://schemas.microsoft.com/office/drawing/2016/5/12/chartex" xmlns:cx7="http://schemas.microsoft.com/office/drawing/2016/5/13/chartex" xmlns:cx8="http://schemas.microsoft.com/office/drawing/2016/5/14/chartex" xmlns:mc="http://schemas.openxmlformats.org/markup-compatibility/2006" xmlns:aink="http://schemas.microsoft.com/office/drawing/2016/ink" xmlns:am3d="http://schemas.microsoft.com/office/drawing/2017/model3d" xmlns:o="urn:schemas-microsoft-com:office:office" xmlns:oel="http://schemas.microsoft.com/office/2019/extlst" xmlns:r="http://schemas.openxmlformats.org/officeDocument/2006/relationships" xmlns:m="http://schemas.openxmlformats.org/officeDocument/2006/math" xmlns:v="urn:schemas-microsoft-com:vml" xmlns:wp14="http://schemas.microsoft.com/office/word/2010/wordprocessingDrawing" xmlns:wp="http://schemas.openxmlformats.org/drawingml/2006/wordprocessingDrawing" xmlns:w10="urn:schemas-microsoft-com:office:word" xmlns:w="http://schemas.openxmlformats.org/wordprocessingml/2006/main" xmlns:w14="http://schemas.microsoft.com/office/word/2010/wordml" xmlns:w15="http://schemas.microsoft.com/office/word/2012/wordml" xmlns:w16cex="http://schemas.microsoft.com/office/word/2018/wordml/cex" xmlns:w16cid="http://schemas.microsoft.com/office/word/2016/wordml/cid" xmlns:w16="http://schemas.microsoft.com/office/word/2018/wordml" xmlns:w16du="http://schemas.microsoft.com/office/word/2023/wordml/word16du" xmlns:w16sdtdh="http://schemas.microsoft.com/office/word/2020/wordml/sdtdatahash" xmlns:w16sdtfl="http://schemas.microsoft.com/office/word/2024/wordml/sdtformatlock" xmlns:w16se="http://schemas.microsoft.com/office/word/2015/wordml/symex" xmlns:wpg="http://schemas.microsoft.com/office/word/2010/wordprocessingGroup" xmlns:wpi="http://schemas.microsoft.com/office/word/2010/wordprocessingInk" xmlns:wne="http://schemas.microsoft.com/office/word/2006/wordml" xmlns:wps="http://schemas.microsoft.com/office/word/2010/wordprocessingShape" mc:Ignorable="w14 w15 w16se w16cid w16 w16cex w16sdtdh w16sdtfl w16du wp14">
+  <w:endnote w:type="separator" w:id="-1">
+    <w:p>
+      <w:r>
+        <w:separator/>
+      </w:r>
+    </w:p>
+  </w:endnote>
+  <w:endnote w:type="continuationSeparator" w:id="0">
+    <w:p>
+      <w:r>
+        <w:continuationSeparator/>
+      </w:r>
+    </w:p>
+  </w:endnote>
+</w:endnotes>
+</file>
+
+<file path=word/footnotes.xml><?xml version="1.0" encoding="utf-8"?>
+<w:footnotes xmlns:wpc="http://schemas.microsoft.com/office/word/2010/wordprocessingCanvas" xmlns:cx="http://schemas.microsoft.com/office/drawing/2014/chartex" xmlns:cx1="http://schemas.microsoft.com/office/drawing/2015/9/8/chartex" xmlns:cx2="http://schemas.microsoft.com/office/drawing/2015/10/21/chartex" xmlns:cx3="http://schemas.microsoft.com/office/drawing/2016/5/9/chartex" xmlns:cx4="http://schemas.microsoft.com/office/drawing/2016/5/10/chartex" xmlns:cx5="http://schemas.microsoft.com/office/drawing/2016/5/11/chartex" xmlns:cx6="http://schemas.microsoft.com/office/drawing/2016/5/12/chartex" xmlns:cx7="http://schemas.microsoft.com/office/drawing/2016/5/13/chartex" xmlns:cx8="http://schemas.microsoft.com/office/drawing/2016/5/14/chartex" xmlns:mc="http://schemas.openxmlformats.org/markup-compatibility/2006" xmlns:aink="http://schemas.microsoft.com/office/drawing/2016/ink" xmlns:am3d="http://schemas.microsoft.com/office/drawing/2017/model3d" xmlns:o="urn:schemas-microsoft-com:office:office" xmlns:oel="http://schemas.microsoft.com/office/2019/extlst" xmlns:r="http://schemas.openxmlformats.org/officeDocument/2006/relationships" xmlns:m="http://schemas.openxmlformats.org/officeDocument/2006/math" xmlns:v="urn:schemas-microsoft-com:vml" xmlns:wp14="http://schemas.microsoft.com/office/word/2010/wordprocessingDrawing" xmlns:wp="http://schemas.openxmlformats.org/drawingml/2006/wordprocessingDrawing" xmlns:w10="urn:schemas-microsoft-com:office:word" xmlns:w="http://schemas.openxmlformats.org/wordprocessingml/2006/main" xmlns:w14="http://schemas.microsoft.com/office/word/2010/wordml" xmlns:w15="http://schemas.microsoft.com/office/word/2012/wordml" xmlns:w16cex="http://schemas.microsoft.com/office/word/2018/wordml/cex" xmlns:w16cid="http://schemas.microsoft.com/office/word/2016/wordml/cid" xmlns:w16="http://schemas.microsoft.com/office/word/2018/wordml" xmlns:w16du="http://schemas.microsoft.com/office/word/2023/wordml/word16du" xmlns:w16sdtdh="http://schemas.microsoft.com/office/word/2020/wordml/sdtdatahash" xmlns:w16sdtfl="http://schemas.microsoft.com/office/word/2024/wordml/sdtformatlock" xmlns:w16se="http://schemas.microsoft.com/office/word/2015/wordml/symex" xmlns:wpg="http://schemas.microsoft.com/office/word/2010/wordprocessingGroup" xmlns:wpi="http://schemas.microsoft.com/office/word/2010/wordprocessingInk" xmlns:wne="http://schemas.microsoft.com/office/word/2006/wordml" xmlns:wps="http://schemas.microsoft.com/office/word/2010/wordprocessingShape" mc:Ignorable="w14 w15 w16se w16cid w16 w16cex w16sdtdh w16sdtfl w16du wp14">
+  <w:footnote w:type="separator" w:id="-1">
+    <w:p>
+      <w:r>
+        <w:separator/>
+      </w:r>
+    </w:p>
+  </w:footnote>
+  <w:footnote w:type="continuationSeparator" w:id="0">
+    <w:p>
+      <w:r>
+        <w:continuationSeparator/>
+      </w:r>
+    </w:p>
+  </w:footnote>
+</w:footnotes>
+</file>
+
 <file path=word/header1.xml><?xml version="1.0" encoding="utf-8"?>
-<w:hdr xmlns:wpc="http://schemas.microsoft.com/office/word/2010/wordprocessingCanvas" xmlns:cx="http://schemas.microsoft.com/office/drawing/2014/chartex" xmlns:cx1="http://schemas.microsoft.com/office/drawing/2015/9/8/chartex" xmlns:cx2="http://schemas.microsoft.com/office/drawing/2015/10/21/chartex" xmlns:cx3="http://schemas.microsoft.com/office/drawing/2016/5/9/chartex" xmlns:cx4="http://schemas.microsoft.com/office/drawing/2016/5/10/chartex" xmlns:cx5="http://schemas.microsoft.com/office/drawing/2016/5/11/chartex" xmlns:mc="http://schemas.openxmlformats.org/markup-compatibility/2006" xmlns:o="urn:schemas-microsoft-com:office:office" xmlns:r="http://schemas.openxmlformats.org/officeDocument/2006/relationships" xmlns:m="http://schemas.openxmlformats.org/officeDocument/2006/math" xmlns:v="urn:schemas-microsoft-com:vml" xmlns:wp14="http://schemas.microsoft.com/office/word/2010/wordprocessingDrawing" xmlns:wp="http://schemas.openxmlformats.org/drawingml/2006/wordprocessingDrawing" xmlns:w10="urn:schemas-microsoft-com:office:word" xmlns:w="http://schemas.openxmlformats.org/wordprocessingml/2006/main" xmlns:w14="http://schemas.microsoft.com/office/word/2010/wordml" xmlns:w15="http://schemas.microsoft.com/office/word/2012/wordml" xmlns:wne="http://schemas.microsoft.com/office/word/2006/wordml" xmlns:wpg="http://schemas.microsoft.com/office/word/2010/wordprocessingGroup" xmlns:wpi="http://schemas.microsoft.com/office/word/2010/wordprocessingInk" xmlns:wps="http://schemas.microsoft.com/office/word/2010/wordprocessingShape" mc:Ignorable="w14 w15 wp14">
+<w:hdr xmlns:wpc="http://schemas.microsoft.com/office/word/2010/wordprocessingCanvas" xmlns:cx="http://schemas.microsoft.com/office/drawing/2014/chartex" xmlns:cx1="http://schemas.microsoft.com/office/drawing/2015/9/8/chartex" xmlns:cx2="http://schemas.microsoft.com/office/drawing/2015/10/21/chartex" xmlns:cx3="http://schemas.microsoft.com/office/drawing/2016/5/9/chartex" xmlns:cx4="http://schemas.microsoft.com/office/drawing/2016/5/10/chartex" xmlns:cx5="http://schemas.microsoft.com/office/drawing/2016/5/11/chartex" xmlns:cx6="http://schemas.microsoft.com/office/drawing/2016/5/12/chartex" xmlns:cx7="http://schemas.microsoft.com/office/drawing/2016/5/13/chartex" xmlns:cx8="http://schemas.microsoft.com/office/drawing/2016/5/14/chartex" xmlns:mc="http://schemas.openxmlformats.org/markup-compatibility/2006" xmlns:aink="http://schemas.microsoft.com/office/drawing/2016/ink" xmlns:am3d="http://schemas.microsoft.com/office/drawing/2017/model3d" xmlns:o="urn:schemas-microsoft-com:office:office" xmlns:oel="http://schemas.microsoft.com/office/2019/extlst" xmlns:r="http://schemas.openxmlformats.org/officeDocument/2006/relationships" xmlns:m="http://schemas.openxmlformats.org/officeDocument/2006/math" xmlns:v="urn:schemas-microsoft-com:vml" xmlns:wp14="http://schemas.microsoft.com/office/word/2010/wordprocessingDrawing" xmlns:wp="http://schemas.openxmlformats.org/drawingml/2006/wordprocessingDrawing" xmlns:w10="urn:schemas-microsoft-com:office:word" xmlns:w="http://schemas.openxmlformats.org/wordprocessingml/2006/main" xmlns:w14="http://schemas.microsoft.com/office/word/2010/wordml" xmlns:w15="http://schemas.microsoft.com/office/word/2012/wordml" xmlns:w16cex="http://schemas.microsoft.com/office/word/2018/wordml/cex" xmlns:w16cid="http://schemas.microsoft.com/office/word/2016/wordml/cid" xmlns:w16="http://schemas.microsoft.com/office/word/2018/wordml" xmlns:w16du="http://schemas.microsoft.com/office/word/2023/wordml/word16du" xmlns:w16sdtdh="http://schemas.microsoft.com/office/word/2020/wordml/sdtdatahash" xmlns:w16sdtfl="http://schemas.microsoft.com/office/word/2024/wordml/sdtformatlock" xmlns:w16se="http://schemas.microsoft.com/office/word/2015/wordml/symex" xmlns:wpg="http://schemas.microsoft.com/office/word/2010/wordprocessingGroup" xmlns:wpi="http://schemas.microsoft.com/office/word/2010/wordprocessingInk" xmlns:wne="http://schemas.microsoft.com/office/word/2006/wordml" xmlns:wps="http://schemas.microsoft.com/office/word/2010/wordprocessingShape" mc:Ignorable="w14 w15 w16se w16cid w16 w16cex w16sdtdh w16sdtfl w16du wp14">
   <w:p>
     <w:pPr>
       <w:pBdr>
@@ -5014,8 +4861,8 @@
 </file>
 
 <file path=word/numbering.xml><?xml version="1.0" encoding="utf-8"?>
-<w:numbering xmlns:wpc="http://schemas.microsoft.com/office/word/2010/wordprocessingCanvas" xmlns:cx="http://schemas.microsoft.com/office/drawing/2014/chartex" xmlns:cx1="http://schemas.microsoft.com/office/drawing/2015/9/8/chartex" xmlns:cx2="http://schemas.microsoft.com/office/drawing/2015/10/21/chartex" xmlns:cx3="http://schemas.microsoft.com/office/drawing/2016/5/9/chartex" xmlns:cx4="http://schemas.microsoft.com/office/drawing/2016/5/10/chartex" xmlns:cx5="http://schemas.microsoft.com/office/drawing/2016/5/11/chartex" xmlns:mc="http://schemas.openxmlformats.org/markup-compatibility/2006" xmlns:o="urn:schemas-microsoft-com:office:office" xmlns:r="http://schemas.openxmlformats.org/officeDocument/2006/relationships" xmlns:m="http://schemas.openxmlformats.org/officeDocument/2006/math" xmlns:v="urn:schemas-microsoft-com:vml" xmlns:wp14="http://schemas.microsoft.com/office/word/2010/wordprocessingDrawing" xmlns:wp="http://schemas.openxmlformats.org/drawingml/2006/wordprocessingDrawing" xmlns:w10="urn:schemas-microsoft-com:office:word" xmlns:w="http://schemas.openxmlformats.org/wordprocessingml/2006/main" xmlns:w14="http://schemas.microsoft.com/office/word/2010/wordml" xmlns:w15="http://schemas.microsoft.com/office/word/2012/wordml" xmlns:wne="http://schemas.microsoft.com/office/word/2006/wordml" xmlns:wpg="http://schemas.microsoft.com/office/word/2010/wordprocessingGroup" xmlns:wpi="http://schemas.microsoft.com/office/word/2010/wordprocessingInk" xmlns:wps="http://schemas.microsoft.com/office/word/2010/wordprocessingShape" mc:Ignorable="w14 w15 wp14">
-  <w:abstractNum w:abstractNumId="0">
+<w:numbering xmlns:wpc="http://schemas.microsoft.com/office/word/2010/wordprocessingCanvas" xmlns:cx="http://schemas.microsoft.com/office/drawing/2014/chartex" xmlns:cx1="http://schemas.microsoft.com/office/drawing/2015/9/8/chartex" xmlns:cx2="http://schemas.microsoft.com/office/drawing/2015/10/21/chartex" xmlns:cx3="http://schemas.microsoft.com/office/drawing/2016/5/9/chartex" xmlns:cx4="http://schemas.microsoft.com/office/drawing/2016/5/10/chartex" xmlns:cx5="http://schemas.microsoft.com/office/drawing/2016/5/11/chartex" xmlns:cx6="http://schemas.microsoft.com/office/drawing/2016/5/12/chartex" xmlns:cx7="http://schemas.microsoft.com/office/drawing/2016/5/13/chartex" xmlns:cx8="http://schemas.microsoft.com/office/drawing/2016/5/14/chartex" xmlns:mc="http://schemas.openxmlformats.org/markup-compatibility/2006" xmlns:aink="http://schemas.microsoft.com/office/drawing/2016/ink" xmlns:am3d="http://schemas.microsoft.com/office/drawing/2017/model3d" xmlns:o="urn:schemas-microsoft-com:office:office" xmlns:oel="http://schemas.microsoft.com/office/2019/extlst" xmlns:r="http://schemas.openxmlformats.org/officeDocument/2006/relationships" xmlns:m="http://schemas.openxmlformats.org/officeDocument/2006/math" xmlns:v="urn:schemas-microsoft-com:vml" xmlns:wp14="http://schemas.microsoft.com/office/word/2010/wordprocessingDrawing" xmlns:wp="http://schemas.openxmlformats.org/drawingml/2006/wordprocessingDrawing" xmlns:w10="urn:schemas-microsoft-com:office:word" xmlns:w="http://schemas.openxmlformats.org/wordprocessingml/2006/main" xmlns:w14="http://schemas.microsoft.com/office/word/2010/wordml" xmlns:w15="http://schemas.microsoft.com/office/word/2012/wordml" xmlns:w16cex="http://schemas.microsoft.com/office/word/2018/wordml/cex" xmlns:w16cid="http://schemas.microsoft.com/office/word/2016/wordml/cid" xmlns:w16="http://schemas.microsoft.com/office/word/2018/wordml" xmlns:w16du="http://schemas.microsoft.com/office/word/2023/wordml/word16du" xmlns:w16sdtdh="http://schemas.microsoft.com/office/word/2020/wordml/sdtdatahash" xmlns:w16sdtfl="http://schemas.microsoft.com/office/word/2024/wordml/sdtformatlock" xmlns:w16se="http://schemas.microsoft.com/office/word/2015/wordml/symex" xmlns:wpg="http://schemas.microsoft.com/office/word/2010/wordprocessingGroup" xmlns:wpi="http://schemas.microsoft.com/office/word/2010/wordprocessingInk" xmlns:wne="http://schemas.microsoft.com/office/word/2006/wordml" xmlns:wps="http://schemas.microsoft.com/office/word/2010/wordprocessingShape" mc:Ignorable="w14 w15 w16se w16cid w16 w16cex w16sdtdh w16sdtfl w16du wp14">
+  <w:abstractNum w:abstractNumId="0" w15:restartNumberingAfterBreak="0">
     <w:nsid w:val="FFFFFF89"/>
     <w:multiLevelType w:val="singleLevel"/>
     <w:tmpl w:val="C4FECB62"/>
@@ -5036,11 +4883,11 @@
       </w:rPr>
     </w:lvl>
   </w:abstractNum>
-  <w:abstractNum w:abstractNumId="1">
+  <w:abstractNum w:abstractNumId="1" w15:restartNumberingAfterBreak="0">
     <w:nsid w:val="1AD81204"/>
     <w:multiLevelType w:val="hybridMultilevel"/>
     <w:tmpl w:val="99B426F4"/>
-    <w:lvl w:ilvl="0">
+    <w:lvl w:ilvl="0" w:tplc="3498344E">
       <w:start w:val="1"/>
       <w:numFmt w:val="bullet"/>
       <w:lvlText w:val=""/>
@@ -5052,7 +4899,7 @@
         <w:rFonts w:ascii="Wingdings" w:hAnsi="Wingdings" w:hint="default"/>
       </w:rPr>
     </w:lvl>
-    <w:lvl w:ilvl="1" w:tentative="1">
+    <w:lvl w:ilvl="1" w:tplc="DDAA81A4" w:tentative="1">
       <w:start w:val="1"/>
       <w:numFmt w:val="bullet"/>
       <w:lvlText w:val="o"/>
@@ -5064,7 +4911,7 @@
         <w:rFonts w:ascii="Courier New" w:hAnsi="Courier New" w:cs="Courier New" w:hint="default"/>
       </w:rPr>
     </w:lvl>
-    <w:lvl w:ilvl="2" w:tentative="1">
+    <w:lvl w:ilvl="2" w:tplc="FBEE9D06" w:tentative="1">
       <w:start w:val="1"/>
       <w:numFmt w:val="bullet"/>
       <w:lvlText w:val=""/>
@@ -5076,7 +4923,7 @@
         <w:rFonts w:ascii="Wingdings" w:hAnsi="Wingdings" w:hint="default"/>
       </w:rPr>
     </w:lvl>
-    <w:lvl w:ilvl="3" w:tentative="1">
+    <w:lvl w:ilvl="3" w:tplc="8E5AAACE" w:tentative="1">
       <w:start w:val="1"/>
       <w:numFmt w:val="bullet"/>
       <w:lvlText w:val=""/>
@@ -5088,7 +4935,7 @@
         <w:rFonts w:ascii="Symbol" w:hAnsi="Symbol" w:hint="default"/>
       </w:rPr>
     </w:lvl>
-    <w:lvl w:ilvl="4" w:tentative="1">
+    <w:lvl w:ilvl="4" w:tplc="236E8832" w:tentative="1">
       <w:start w:val="1"/>
       <w:numFmt w:val="bullet"/>
       <w:lvlText w:val="o"/>
@@ -5100,7 +4947,7 @@
         <w:rFonts w:ascii="Courier New" w:hAnsi="Courier New" w:cs="Courier New" w:hint="default"/>
       </w:rPr>
     </w:lvl>
-    <w:lvl w:ilvl="5" w:tentative="1">
+    <w:lvl w:ilvl="5" w:tplc="648E0CC8" w:tentative="1">
       <w:start w:val="1"/>
       <w:numFmt w:val="bullet"/>
       <w:lvlText w:val=""/>
@@ -5112,7 +4959,7 @@
         <w:rFonts w:ascii="Wingdings" w:hAnsi="Wingdings" w:hint="default"/>
       </w:rPr>
     </w:lvl>
-    <w:lvl w:ilvl="6" w:tentative="1">
+    <w:lvl w:ilvl="6" w:tplc="BC861868" w:tentative="1">
       <w:start w:val="1"/>
       <w:numFmt w:val="bullet"/>
       <w:lvlText w:val=""/>
@@ -5124,7 +4971,7 @@
         <w:rFonts w:ascii="Symbol" w:hAnsi="Symbol" w:hint="default"/>
       </w:rPr>
     </w:lvl>
-    <w:lvl w:ilvl="7" w:tentative="1">
+    <w:lvl w:ilvl="7" w:tplc="C59A180C" w:tentative="1">
       <w:start w:val="1"/>
       <w:numFmt w:val="bullet"/>
       <w:lvlText w:val="o"/>
@@ -5136,7 +4983,7 @@
         <w:rFonts w:ascii="Courier New" w:hAnsi="Courier New" w:cs="Courier New" w:hint="default"/>
       </w:rPr>
     </w:lvl>
-    <w:lvl w:ilvl="8" w:tentative="1">
+    <w:lvl w:ilvl="8" w:tplc="EDB49640" w:tentative="1">
       <w:start w:val="1"/>
       <w:numFmt w:val="bullet"/>
       <w:lvlText w:val=""/>
@@ -5149,7 +4996,7 @@
       </w:rPr>
     </w:lvl>
   </w:abstractNum>
-  <w:abstractNum w:abstractNumId="2">
+  <w:abstractNum w:abstractNumId="2" w15:restartNumberingAfterBreak="0">
     <w:nsid w:val="435F5996"/>
     <w:multiLevelType w:val="multilevel"/>
     <w:tmpl w:val="5472F6AA"/>
@@ -5264,7 +5111,7 @@
       </w:rPr>
     </w:lvl>
   </w:abstractNum>
-  <w:abstractNum w:abstractNumId="3">
+  <w:abstractNum w:abstractNumId="3" w15:restartNumberingAfterBreak="0">
     <w:nsid w:val="43CD581F"/>
     <w:multiLevelType w:val="multilevel"/>
     <w:tmpl w:val="EAAA1772"/>
@@ -5380,11 +5227,11 @@
       </w:rPr>
     </w:lvl>
   </w:abstractNum>
-  <w:abstractNum w:abstractNumId="4">
+  <w:abstractNum w:abstractNumId="4" w15:restartNumberingAfterBreak="0">
     <w:nsid w:val="52C0632A"/>
     <w:multiLevelType w:val="hybridMultilevel"/>
     <w:tmpl w:val="265E44A2"/>
-    <w:lvl w:ilvl="0">
+    <w:lvl w:ilvl="0" w:tplc="C41608B0">
       <w:start w:val="1"/>
       <w:numFmt w:val="bullet"/>
       <w:lvlText w:val=""/>
@@ -5396,7 +5243,7 @@
         <w:rFonts w:ascii="Wingdings" w:hAnsi="Wingdings" w:hint="default"/>
       </w:rPr>
     </w:lvl>
-    <w:lvl w:ilvl="1" w:tentative="1">
+    <w:lvl w:ilvl="1" w:tplc="A89ABFF6" w:tentative="1">
       <w:start w:val="1"/>
       <w:numFmt w:val="bullet"/>
       <w:lvlText w:val="o"/>
@@ -5408,7 +5255,7 @@
         <w:rFonts w:ascii="Courier New" w:hAnsi="Courier New" w:cs="Courier New" w:hint="default"/>
       </w:rPr>
     </w:lvl>
-    <w:lvl w:ilvl="2" w:tentative="1">
+    <w:lvl w:ilvl="2" w:tplc="ECD09DF8" w:tentative="1">
       <w:start w:val="1"/>
       <w:numFmt w:val="bullet"/>
       <w:lvlText w:val=""/>
@@ -5420,7 +5267,7 @@
         <w:rFonts w:ascii="Wingdings" w:hAnsi="Wingdings" w:hint="default"/>
       </w:rPr>
     </w:lvl>
-    <w:lvl w:ilvl="3" w:tentative="1">
+    <w:lvl w:ilvl="3" w:tplc="A0C6429C" w:tentative="1">
       <w:start w:val="1"/>
       <w:numFmt w:val="bullet"/>
       <w:lvlText w:val=""/>
@@ -5432,7 +5279,7 @@
         <w:rFonts w:ascii="Symbol" w:hAnsi="Symbol" w:hint="default"/>
       </w:rPr>
     </w:lvl>
-    <w:lvl w:ilvl="4" w:tentative="1">
+    <w:lvl w:ilvl="4" w:tplc="B1B6361E" w:tentative="1">
       <w:start w:val="1"/>
       <w:numFmt w:val="bullet"/>
       <w:lvlText w:val="o"/>
@@ -5444,7 +5291,7 @@
         <w:rFonts w:ascii="Courier New" w:hAnsi="Courier New" w:cs="Courier New" w:hint="default"/>
       </w:rPr>
     </w:lvl>
-    <w:lvl w:ilvl="5" w:tentative="1">
+    <w:lvl w:ilvl="5" w:tplc="A8AC70E4" w:tentative="1">
       <w:start w:val="1"/>
       <w:numFmt w:val="bullet"/>
       <w:lvlText w:val=""/>
@@ -5456,7 +5303,7 @@
         <w:rFonts w:ascii="Wingdings" w:hAnsi="Wingdings" w:hint="default"/>
       </w:rPr>
     </w:lvl>
-    <w:lvl w:ilvl="6" w:tentative="1">
+    <w:lvl w:ilvl="6" w:tplc="7D3CDC72" w:tentative="1">
       <w:start w:val="1"/>
       <w:numFmt w:val="bullet"/>
       <w:lvlText w:val=""/>
@@ -5468,7 +5315,7 @@
         <w:rFonts w:ascii="Symbol" w:hAnsi="Symbol" w:hint="default"/>
       </w:rPr>
     </w:lvl>
-    <w:lvl w:ilvl="7" w:tentative="1">
+    <w:lvl w:ilvl="7" w:tplc="812E24AE" w:tentative="1">
       <w:start w:val="1"/>
       <w:numFmt w:val="bullet"/>
       <w:lvlText w:val="o"/>
@@ -5480,7 +5327,7 @@
         <w:rFonts w:ascii="Courier New" w:hAnsi="Courier New" w:cs="Courier New" w:hint="default"/>
       </w:rPr>
     </w:lvl>
-    <w:lvl w:ilvl="8" w:tentative="1">
+    <w:lvl w:ilvl="8" w:tplc="6C300DF2" w:tentative="1">
       <w:start w:val="1"/>
       <w:numFmt w:val="bullet"/>
       <w:lvlText w:val=""/>
@@ -5493,7 +5340,7 @@
       </w:rPr>
     </w:lvl>
   </w:abstractNum>
-  <w:abstractNum w:abstractNumId="5">
+  <w:abstractNum w:abstractNumId="5" w15:restartNumberingAfterBreak="0">
     <w:nsid w:val="553B02E1"/>
     <w:multiLevelType w:val="multilevel"/>
     <w:tmpl w:val="5746A2D2"/>
@@ -5609,7 +5456,7 @@
       </w:rPr>
     </w:lvl>
   </w:abstractNum>
-  <w:abstractNum w:abstractNumId="6">
+  <w:abstractNum w:abstractNumId="6" w15:restartNumberingAfterBreak="0">
     <w:nsid w:val="5A27491D"/>
     <w:multiLevelType w:val="multilevel"/>
     <w:tmpl w:val="339EA990"/>
@@ -5724,7 +5571,7 @@
       </w:rPr>
     </w:lvl>
   </w:abstractNum>
-  <w:abstractNum w:abstractNumId="7">
+  <w:abstractNum w:abstractNumId="7" w15:restartNumberingAfterBreak="0">
     <w:nsid w:val="5F895F7E"/>
     <w:multiLevelType w:val="multilevel"/>
     <w:tmpl w:val="5860B904"/>
@@ -5840,7 +5687,7 @@
       </w:rPr>
     </w:lvl>
   </w:abstractNum>
-  <w:abstractNum w:abstractNumId="8">
+  <w:abstractNum w:abstractNumId="8" w15:restartNumberingAfterBreak="0">
     <w:nsid w:val="6BC40A80"/>
     <w:multiLevelType w:val="multilevel"/>
     <w:tmpl w:val="1F30C6CE"/>
@@ -5956,11 +5803,11 @@
       </w:rPr>
     </w:lvl>
   </w:abstractNum>
-  <w:abstractNum w:abstractNumId="9">
+  <w:abstractNum w:abstractNumId="9" w15:restartNumberingAfterBreak="0">
     <w:nsid w:val="72D77174"/>
     <w:multiLevelType w:val="hybridMultilevel"/>
     <w:tmpl w:val="78BE7F24"/>
-    <w:lvl w:ilvl="0">
+    <w:lvl w:ilvl="0" w:tplc="70EA53B8">
       <w:start w:val="1"/>
       <w:numFmt w:val="bullet"/>
       <w:lvlText w:val=""/>
@@ -5972,7 +5819,7 @@
         <w:rFonts w:ascii="Wingdings" w:hAnsi="Wingdings" w:hint="default"/>
       </w:rPr>
     </w:lvl>
-    <w:lvl w:ilvl="1" w:tentative="1">
+    <w:lvl w:ilvl="1" w:tplc="2114706E" w:tentative="1">
       <w:start w:val="1"/>
       <w:numFmt w:val="bullet"/>
       <w:lvlText w:val="o"/>
@@ -5984,7 +5831,7 @@
         <w:rFonts w:ascii="Courier New" w:hAnsi="Courier New" w:cs="Courier New" w:hint="default"/>
       </w:rPr>
     </w:lvl>
-    <w:lvl w:ilvl="2" w:tentative="1">
+    <w:lvl w:ilvl="2" w:tplc="C65657EA" w:tentative="1">
       <w:start w:val="1"/>
       <w:numFmt w:val="bullet"/>
       <w:lvlText w:val=""/>
@@ -5996,7 +5843,7 @@
         <w:rFonts w:ascii="Wingdings" w:hAnsi="Wingdings" w:hint="default"/>
       </w:rPr>
     </w:lvl>
-    <w:lvl w:ilvl="3" w:tentative="1">
+    <w:lvl w:ilvl="3" w:tplc="43F46850" w:tentative="1">
       <w:start w:val="1"/>
       <w:numFmt w:val="bullet"/>
       <w:lvlText w:val=""/>
@@ -6008,7 +5855,7 @@
         <w:rFonts w:ascii="Symbol" w:hAnsi="Symbol" w:hint="default"/>
       </w:rPr>
     </w:lvl>
-    <w:lvl w:ilvl="4" w:tentative="1">
+    <w:lvl w:ilvl="4" w:tplc="43A8FBDA" w:tentative="1">
       <w:start w:val="1"/>
       <w:numFmt w:val="bullet"/>
       <w:lvlText w:val="o"/>
@@ -6020,7 +5867,7 @@
         <w:rFonts w:ascii="Courier New" w:hAnsi="Courier New" w:cs="Courier New" w:hint="default"/>
       </w:rPr>
     </w:lvl>
-    <w:lvl w:ilvl="5" w:tentative="1">
+    <w:lvl w:ilvl="5" w:tplc="96769E34" w:tentative="1">
       <w:start w:val="1"/>
       <w:numFmt w:val="bullet"/>
       <w:lvlText w:val=""/>
@@ -6032,7 +5879,7 @@
         <w:rFonts w:ascii="Wingdings" w:hAnsi="Wingdings" w:hint="default"/>
       </w:rPr>
     </w:lvl>
-    <w:lvl w:ilvl="6" w:tentative="1">
+    <w:lvl w:ilvl="6" w:tplc="97EA7008" w:tentative="1">
       <w:start w:val="1"/>
       <w:numFmt w:val="bullet"/>
       <w:lvlText w:val=""/>
@@ -6044,7 +5891,7 @@
         <w:rFonts w:ascii="Symbol" w:hAnsi="Symbol" w:hint="default"/>
       </w:rPr>
     </w:lvl>
-    <w:lvl w:ilvl="7" w:tentative="1">
+    <w:lvl w:ilvl="7" w:tplc="7CE85608" w:tentative="1">
       <w:start w:val="1"/>
       <w:numFmt w:val="bullet"/>
       <w:lvlText w:val="o"/>
@@ -6056,7 +5903,7 @@
         <w:rFonts w:ascii="Courier New" w:hAnsi="Courier New" w:cs="Courier New" w:hint="default"/>
       </w:rPr>
     </w:lvl>
-    <w:lvl w:ilvl="8" w:tentative="1">
+    <w:lvl w:ilvl="8" w:tplc="EB965FFA" w:tentative="1">
       <w:start w:val="1"/>
       <w:numFmt w:val="bullet"/>
       <w:lvlText w:val=""/>
@@ -6069,41 +5916,41 @@
       </w:rPr>
     </w:lvl>
   </w:abstractNum>
-  <w:num w:numId="1">
+  <w:num w:numId="1" w16cid:durableId="1709337572">
     <w:abstractNumId w:val="7"/>
   </w:num>
-  <w:num w:numId="2">
+  <w:num w:numId="2" w16cid:durableId="1760708909">
     <w:abstractNumId w:val="3"/>
   </w:num>
-  <w:num w:numId="3">
+  <w:num w:numId="3" w16cid:durableId="1810704899">
     <w:abstractNumId w:val="6"/>
   </w:num>
-  <w:num w:numId="4">
+  <w:num w:numId="4" w16cid:durableId="1026373906">
     <w:abstractNumId w:val="5"/>
   </w:num>
-  <w:num w:numId="5">
+  <w:num w:numId="5" w16cid:durableId="525098205">
     <w:abstractNumId w:val="8"/>
   </w:num>
-  <w:num w:numId="6">
+  <w:num w:numId="6" w16cid:durableId="1099788973">
     <w:abstractNumId w:val="2"/>
   </w:num>
-  <w:num w:numId="7">
+  <w:num w:numId="7" w16cid:durableId="2139059091">
     <w:abstractNumId w:val="0"/>
   </w:num>
-  <w:num w:numId="8">
+  <w:num w:numId="8" w16cid:durableId="1842770198">
     <w:abstractNumId w:val="1"/>
   </w:num>
-  <w:num w:numId="9">
+  <w:num w:numId="9" w16cid:durableId="822698836">
     <w:abstractNumId w:val="4"/>
   </w:num>
-  <w:num w:numId="10">
+  <w:num w:numId="10" w16cid:durableId="2131388451">
     <w:abstractNumId w:val="9"/>
   </w:num>
 </w:numbering>
 </file>
 
 <file path=word/styles.xml><?xml version="1.0" encoding="utf-8"?>
-<w:styles xmlns:mc="http://schemas.openxmlformats.org/markup-compatibility/2006" xmlns:r="http://schemas.openxmlformats.org/officeDocument/2006/relationships" xmlns:w="http://schemas.openxmlformats.org/wordprocessingml/2006/main" xmlns:w14="http://schemas.microsoft.com/office/word/2010/wordml" xmlns:w15="http://schemas.microsoft.com/office/word/2012/wordml" mc:Ignorable="w14 w15">
+<w:styles xmlns:mc="http://schemas.openxmlformats.org/markup-compatibility/2006" xmlns:r="http://schemas.openxmlformats.org/officeDocument/2006/relationships" xmlns:w="http://schemas.openxmlformats.org/wordprocessingml/2006/main" xmlns:w14="http://schemas.microsoft.com/office/word/2010/wordml" xmlns:w15="http://schemas.microsoft.com/office/word/2012/wordml" xmlns:w16cex="http://schemas.microsoft.com/office/word/2018/wordml/cex" xmlns:w16cid="http://schemas.microsoft.com/office/word/2016/wordml/cid" xmlns:w16="http://schemas.microsoft.com/office/word/2018/wordml" xmlns:w16du="http://schemas.microsoft.com/office/word/2023/wordml/word16du" xmlns:w16sdtdh="http://schemas.microsoft.com/office/word/2020/wordml/sdtdatahash" xmlns:w16sdtfl="http://schemas.microsoft.com/office/word/2024/wordml/sdtformatlock" xmlns:w16se="http://schemas.microsoft.com/office/word/2015/wordml/symex" mc:Ignorable="w14 w15 w16se w16cid w16 w16cex w16sdtdh w16sdtfl w16du">
   <w:docDefaults>
     <w:rPrDefault>
       <w:rPr>
@@ -6683,8 +6530,8 @@
       <w:u w:val="single"/>
     </w:rPr>
   </w:style>
-  <w:style w:type="character" w:customStyle="1" w:styleId="UnresolvedMention">
-    <w:name w:val="Unresolved Mention"/>
+  <w:style w:type="character" w:customStyle="1" w:styleId="UnresolvedMention1">
+    <w:name w:val="Unresolved Mention1"/>
     <w:basedOn w:val="DefaultParagraphFont"/>
     <w:uiPriority w:val="99"/>
     <w:semiHidden/>

</xml_diff>